<commit_message>
Añado unión entre apartados
</commit_message>
<xml_diff>
--- a/Informe/Guion_exposición-Claudia-.docx
+++ b/Informe/Guion_exposición-Claudia-.docx
@@ -210,7 +210,52 @@
           <w:sz w:val="22"/>
           <w:szCs w:val="22"/>
         </w:rPr>
-        <w:t>al conocido sesgo del «condicionamiento por collider» o la paradoja de Berkson. En este contexto, la variable "observación del tumor" actúa como un col</w:t>
+        <w:t xml:space="preserve">al conocido sesgo del «condicionamiento por </w:t>
+      </w:r>
+      <w:proofErr w:type="spellStart"/>
+      <w:r>
+        <w:rPr>
+          <w:rFonts w:ascii="Calibri" w:hAnsi="Calibri" w:cs="Calibri"/>
+          <w:sz w:val="22"/>
+          <w:szCs w:val="22"/>
+        </w:rPr>
+        <w:t>collider</w:t>
+      </w:r>
+      <w:proofErr w:type="spellEnd"/>
+      <w:r>
+        <w:rPr>
+          <w:rFonts w:ascii="Calibri" w:hAnsi="Calibri" w:cs="Calibri"/>
+          <w:sz w:val="22"/>
+          <w:szCs w:val="22"/>
+        </w:rPr>
+        <w:t xml:space="preserve">» o la paradoja de </w:t>
+      </w:r>
+      <w:proofErr w:type="spellStart"/>
+      <w:r>
+        <w:rPr>
+          <w:rFonts w:ascii="Calibri" w:hAnsi="Calibri" w:cs="Calibri"/>
+          <w:sz w:val="22"/>
+          <w:szCs w:val="22"/>
+        </w:rPr>
+        <w:t>Berkson</w:t>
+      </w:r>
+      <w:proofErr w:type="spellEnd"/>
+      <w:r>
+        <w:rPr>
+          <w:rFonts w:ascii="Calibri" w:hAnsi="Calibri" w:cs="Calibri"/>
+          <w:sz w:val="22"/>
+          <w:szCs w:val="22"/>
+        </w:rPr>
+        <w:t xml:space="preserve">. En este contexto, la variable "observación del tumor" actúa como un </w:t>
+      </w:r>
+      <w:proofErr w:type="spellStart"/>
+      <w:r>
+        <w:rPr>
+          <w:rFonts w:ascii="Calibri" w:hAnsi="Calibri" w:cs="Calibri"/>
+          <w:sz w:val="22"/>
+          <w:szCs w:val="22"/>
+        </w:rPr>
+        <w:t>col</w:t>
       </w:r>
       <w:r>
         <w:rPr>
@@ -220,6 +265,7 @@
         </w:rPr>
         <w:t>lider</w:t>
       </w:r>
+      <w:proofErr w:type="spellEnd"/>
       <w:r>
         <w:rPr>
           <w:rFonts w:ascii="Calibri" w:hAnsi="Calibri" w:cs="Calibri"/>
@@ -328,13 +374,23 @@
         </w:rPr>
         <w:t>Θ</w:t>
       </w:r>
-      <w:r>
-        <w:rPr>
-          <w:rFonts w:ascii="Calibri" w:hAnsi="Calibri" w:cs="Calibri"/>
-          <w:sz w:val="22"/>
-          <w:szCs w:val="22"/>
-        </w:rPr>
-        <w:t xml:space="preserve">ii y las interacciones entre eventos </w:t>
+      <w:proofErr w:type="spellStart"/>
+      <w:r>
+        <w:rPr>
+          <w:rFonts w:ascii="Calibri" w:hAnsi="Calibri" w:cs="Calibri"/>
+          <w:sz w:val="22"/>
+          <w:szCs w:val="22"/>
+        </w:rPr>
+        <w:t>ii</w:t>
+      </w:r>
+      <w:proofErr w:type="spellEnd"/>
+      <w:r>
+        <w:rPr>
+          <w:rFonts w:ascii="Calibri" w:hAnsi="Calibri" w:cs="Calibri"/>
+          <w:sz w:val="22"/>
+          <w:szCs w:val="22"/>
+        </w:rPr>
+        <w:t xml:space="preserve"> y las interacciones entre eventos </w:t>
       </w:r>
       <w:r>
         <w:rPr>
@@ -344,13 +400,23 @@
         </w:rPr>
         <w:t>Θ</w:t>
       </w:r>
-      <w:r>
-        <w:rPr>
-          <w:rFonts w:ascii="Calibri" w:hAnsi="Calibri" w:cs="Calibri"/>
-          <w:sz w:val="22"/>
-          <w:szCs w:val="22"/>
-        </w:rPr>
-        <w:t xml:space="preserve">ij. La matriz </w:t>
+      <w:proofErr w:type="spellStart"/>
+      <w:r>
+        <w:rPr>
+          <w:rFonts w:ascii="Calibri" w:hAnsi="Calibri" w:cs="Calibri"/>
+          <w:sz w:val="22"/>
+          <w:szCs w:val="22"/>
+        </w:rPr>
+        <w:t>ij</w:t>
+      </w:r>
+      <w:proofErr w:type="spellEnd"/>
+      <w:r>
+        <w:rPr>
+          <w:rFonts w:ascii="Calibri" w:hAnsi="Calibri" w:cs="Calibri"/>
+          <w:sz w:val="22"/>
+          <w:szCs w:val="22"/>
+        </w:rPr>
+        <w:t xml:space="preserve">. La matriz </w:t>
       </w:r>
       <w:r>
         <w:rPr>
@@ -400,13 +466,23 @@
         </w:rPr>
         <w:t>Θ</w:t>
       </w:r>
-      <w:r>
-        <w:rPr>
-          <w:rFonts w:ascii="Calibri" w:hAnsi="Calibri" w:cs="Calibri"/>
-          <w:sz w:val="22"/>
-          <w:szCs w:val="22"/>
-        </w:rPr>
-        <w:t>ij representa el impacto directo del evento j</w:t>
+      <w:proofErr w:type="spellStart"/>
+      <w:r>
+        <w:rPr>
+          <w:rFonts w:ascii="Calibri" w:hAnsi="Calibri" w:cs="Calibri"/>
+          <w:sz w:val="22"/>
+          <w:szCs w:val="22"/>
+        </w:rPr>
+        <w:t>ij</w:t>
+      </w:r>
+      <w:proofErr w:type="spellEnd"/>
+      <w:r>
+        <w:rPr>
+          <w:rFonts w:ascii="Calibri" w:hAnsi="Calibri" w:cs="Calibri"/>
+          <w:sz w:val="22"/>
+          <w:szCs w:val="22"/>
+        </w:rPr>
+        <w:t xml:space="preserve"> representa el impacto directo del evento j</w:t>
       </w:r>
       <w:r>
         <w:rPr>
@@ -422,7 +498,7 @@
           <w:sz w:val="22"/>
           <w:szCs w:val="22"/>
         </w:rPr>
-        <w:t>sobre el evento i en términos del riesgo o probabilidad de un evento perjudicial. La diagonal representa los riesgos sin considerar interdependencias.</w:t>
+        <w:t>sobre el evento i en términos del riesgo. La diagonal representa los riesgos sin considerar interdependencias.</w:t>
       </w:r>
     </w:p>
     <w:p>
@@ -440,7 +516,25 @@
           <w:sz w:val="22"/>
           <w:szCs w:val="22"/>
         </w:rPr>
-        <w:t>El nuevo modelo oMHN incorpora explícitamente el evento de observación en la red causal como un evento adicional</w:t>
+        <w:t xml:space="preserve">El nuevo modelo </w:t>
+      </w:r>
+      <w:proofErr w:type="spellStart"/>
+      <w:r>
+        <w:rPr>
+          <w:rFonts w:ascii="Calibri" w:hAnsi="Calibri" w:cs="Calibri"/>
+          <w:sz w:val="22"/>
+          <w:szCs w:val="22"/>
+        </w:rPr>
+        <w:t>oMHN</w:t>
+      </w:r>
+      <w:proofErr w:type="spellEnd"/>
+      <w:r>
+        <w:rPr>
+          <w:rFonts w:ascii="Calibri" w:hAnsi="Calibri" w:cs="Calibri"/>
+          <w:sz w:val="22"/>
+          <w:szCs w:val="22"/>
+        </w:rPr>
+        <w:t xml:space="preserve"> incorpora explícitamente el evento de observación en la red causal como un evento adicional</w:t>
       </w:r>
       <w:r>
         <w:rPr>
@@ -546,7 +640,25 @@
           <w:sz w:val="22"/>
           <w:szCs w:val="22"/>
         </w:rPr>
-        <w:t>Estos modelos trabajan con datos transversales, es decir, diferentes sujetos son tomados en tiempos diferentes (independientes). Estos datos se recogen en una matriz binaria en la cual las filas representan pacientes o sujetos y las columnas genes/SNPs/etc. Cada celda puede contener un 1 si el evento está presente o un 0 si</w:t>
+        <w:t>Estos modelos trabajan con datos transversales, es decir, diferentes sujetos son tomados en tiempos diferentes (independientes). Estos datos se recogen en una matriz binaria en la cual las filas representan pacientes o sujetos y las columnas genes/</w:t>
+      </w:r>
+      <w:proofErr w:type="spellStart"/>
+      <w:r>
+        <w:rPr>
+          <w:rFonts w:ascii="Calibri" w:hAnsi="Calibri" w:cs="Calibri"/>
+          <w:sz w:val="22"/>
+          <w:szCs w:val="22"/>
+        </w:rPr>
+        <w:t>SNPs</w:t>
+      </w:r>
+      <w:proofErr w:type="spellEnd"/>
+      <w:r>
+        <w:rPr>
+          <w:rFonts w:ascii="Calibri" w:hAnsi="Calibri" w:cs="Calibri"/>
+          <w:sz w:val="22"/>
+          <w:szCs w:val="22"/>
+        </w:rPr>
+        <w:t>/etc. Cada celda puede contener un 1 si el evento está presente o un 0 si</w:t>
       </w:r>
       <w:r>
         <w:rPr>
@@ -555,6 +667,32 @@
           <w:szCs w:val="22"/>
         </w:rPr>
         <w:t>no lo está.</w:t>
+      </w:r>
+    </w:p>
+    <w:p>
+      <w:pPr>
+        <w:jc w:val="both"/>
+        <w:rPr>
+          <w:rFonts w:ascii="Calibri" w:hAnsi="Calibri" w:cs="Calibri"/>
+          <w:sz w:val="22"/>
+          <w:szCs w:val="22"/>
+        </w:rPr>
+      </w:pPr>
+      <w:r>
+        <w:rPr>
+          <w:rFonts w:ascii="Calibri" w:hAnsi="Calibri" w:cs="Calibri"/>
+          <w:sz w:val="22"/>
+          <w:szCs w:val="22"/>
+        </w:rPr>
+        <w:t>Tanto en Python como en R existen dos paquetes que nos permiten poder realizar modelo MHN. Pasamos a analizar cada uno de ellos</w:t>
+      </w:r>
+      <w:r>
+        <w:rPr>
+          <w:rFonts w:ascii="Calibri" w:hAnsi="Calibri" w:cs="Calibri"/>
+          <w:sz w:val="22"/>
+          <w:szCs w:val="22"/>
+        </w:rPr>
+        <w:t>.</w:t>
       </w:r>
     </w:p>
     <w:p>
@@ -606,7 +744,6 @@
           <w:sz w:val="28"/>
           <w:szCs w:val="28"/>
         </w:rPr>
-        <w:lastRenderedPageBreak/>
         <w:t>FUNCIONALIDADES PYTHON</w:t>
       </w:r>
     </w:p>
@@ -625,15 +762,87 @@
           <w:sz w:val="22"/>
           <w:szCs w:val="22"/>
         </w:rPr>
-        <w:t>El módulo mhn de Python</w:t>
-      </w:r>
-      <w:r>
-        <w:rPr>
-          <w:rFonts w:ascii="Calibri" w:hAnsi="Calibri" w:cs="Calibri"/>
-          <w:sz w:val="22"/>
-          <w:szCs w:val="22"/>
-        </w:rPr>
-        <w:t xml:space="preserve"> permiten calcular tanto el modelo cMHN como el corregido oMHN, para ello escogemos la función optimizer e indica</w:t>
+        <w:t xml:space="preserve">El módulo </w:t>
+      </w:r>
+      <w:proofErr w:type="spellStart"/>
+      <w:r>
+        <w:rPr>
+          <w:rFonts w:ascii="Calibri" w:hAnsi="Calibri" w:cs="Calibri"/>
+          <w:sz w:val="22"/>
+          <w:szCs w:val="22"/>
+        </w:rPr>
+        <w:t>mhn</w:t>
+      </w:r>
+      <w:proofErr w:type="spellEnd"/>
+      <w:r>
+        <w:rPr>
+          <w:rFonts w:ascii="Calibri" w:hAnsi="Calibri" w:cs="Calibri"/>
+          <w:sz w:val="22"/>
+          <w:szCs w:val="22"/>
+        </w:rPr>
+        <w:t xml:space="preserve"> de Python</w:t>
+      </w:r>
+      <w:r>
+        <w:rPr>
+          <w:rFonts w:ascii="Calibri" w:hAnsi="Calibri" w:cs="Calibri"/>
+          <w:sz w:val="22"/>
+          <w:szCs w:val="22"/>
+        </w:rPr>
+        <w:t xml:space="preserve"> permiten calcular tanto el modelo </w:t>
+      </w:r>
+      <w:proofErr w:type="spellStart"/>
+      <w:r>
+        <w:rPr>
+          <w:rFonts w:ascii="Calibri" w:hAnsi="Calibri" w:cs="Calibri"/>
+          <w:sz w:val="22"/>
+          <w:szCs w:val="22"/>
+        </w:rPr>
+        <w:t>cMHN</w:t>
+      </w:r>
+      <w:proofErr w:type="spellEnd"/>
+      <w:r>
+        <w:rPr>
+          <w:rFonts w:ascii="Calibri" w:hAnsi="Calibri" w:cs="Calibri"/>
+          <w:sz w:val="22"/>
+          <w:szCs w:val="22"/>
+        </w:rPr>
+        <w:t xml:space="preserve"> como el corregido </w:t>
+      </w:r>
+      <w:proofErr w:type="spellStart"/>
+      <w:r>
+        <w:rPr>
+          <w:rFonts w:ascii="Calibri" w:hAnsi="Calibri" w:cs="Calibri"/>
+          <w:sz w:val="22"/>
+          <w:szCs w:val="22"/>
+        </w:rPr>
+        <w:t>oMHN</w:t>
+      </w:r>
+      <w:proofErr w:type="spellEnd"/>
+      <w:r>
+        <w:rPr>
+          <w:rFonts w:ascii="Calibri" w:hAnsi="Calibri" w:cs="Calibri"/>
+          <w:sz w:val="22"/>
+          <w:szCs w:val="22"/>
+        </w:rPr>
+        <w:t xml:space="preserve">, para ello escogemos la función </w:t>
+      </w:r>
+      <w:proofErr w:type="spellStart"/>
+      <w:r>
+        <w:rPr>
+          <w:rFonts w:ascii="Calibri" w:hAnsi="Calibri" w:cs="Calibri"/>
+          <w:sz w:val="22"/>
+          <w:szCs w:val="22"/>
+        </w:rPr>
+        <w:t>optimizer</w:t>
+      </w:r>
+      <w:proofErr w:type="spellEnd"/>
+      <w:r>
+        <w:rPr>
+          <w:rFonts w:ascii="Calibri" w:hAnsi="Calibri" w:cs="Calibri"/>
+          <w:sz w:val="22"/>
+          <w:szCs w:val="22"/>
+        </w:rPr>
+        <w:t xml:space="preserve"> e indica</w:t>
       </w:r>
       <w:r>
         <w:rPr>
@@ -649,7 +858,43 @@
           <w:sz w:val="22"/>
           <w:szCs w:val="22"/>
         </w:rPr>
-        <w:t xml:space="preserve"> cuál usaremos: cMHNOptimizer u oMHNOptimizer.</w:t>
+        <w:t xml:space="preserve"> cuál usaremos: </w:t>
+      </w:r>
+      <w:proofErr w:type="spellStart"/>
+      <w:r>
+        <w:rPr>
+          <w:rFonts w:ascii="Calibri" w:hAnsi="Calibri" w:cs="Calibri"/>
+          <w:sz w:val="22"/>
+          <w:szCs w:val="22"/>
+        </w:rPr>
+        <w:t>cMHNOptimizer</w:t>
+      </w:r>
+      <w:proofErr w:type="spellEnd"/>
+      <w:r>
+        <w:rPr>
+          <w:rFonts w:ascii="Calibri" w:hAnsi="Calibri" w:cs="Calibri"/>
+          <w:sz w:val="22"/>
+          <w:szCs w:val="22"/>
+        </w:rPr>
+        <w:t xml:space="preserve"> u </w:t>
+      </w:r>
+      <w:proofErr w:type="spellStart"/>
+      <w:r>
+        <w:rPr>
+          <w:rFonts w:ascii="Calibri" w:hAnsi="Calibri" w:cs="Calibri"/>
+          <w:sz w:val="22"/>
+          <w:szCs w:val="22"/>
+        </w:rPr>
+        <w:t>oMHNOptimizer</w:t>
+      </w:r>
+      <w:proofErr w:type="spellEnd"/>
+      <w:r>
+        <w:rPr>
+          <w:rFonts w:ascii="Calibri" w:hAnsi="Calibri" w:cs="Calibri"/>
+          <w:sz w:val="22"/>
+          <w:szCs w:val="22"/>
+        </w:rPr>
+        <w:t>.</w:t>
       </w:r>
     </w:p>
     <w:p>
@@ -691,31 +936,95 @@
           <w:sz w:val="22"/>
           <w:szCs w:val="22"/>
         </w:rPr>
-        <w:t xml:space="preserve"> de matriz binaria, la cual se puede importar con el módulo pandas y la función load</w:t>
-      </w:r>
-      <w:r>
-        <w:rPr>
-          <w:rFonts w:ascii="Calibri" w:hAnsi="Calibri" w:cs="Calibri"/>
-          <w:sz w:val="22"/>
-          <w:szCs w:val="22"/>
-        </w:rPr>
-        <w:t>_data_matrix</w:t>
-      </w:r>
-      <w:r>
-        <w:rPr>
-          <w:rFonts w:ascii="Calibri" w:hAnsi="Calibri" w:cs="Calibri"/>
-          <w:sz w:val="22"/>
-          <w:szCs w:val="22"/>
-        </w:rPr>
-        <w:t xml:space="preserve">() o, en caso de que esté en un fichero csv, directamente </w:t>
-      </w:r>
-      <w:r>
-        <w:rPr>
-          <w:rFonts w:ascii="Calibri" w:hAnsi="Calibri" w:cs="Calibri"/>
-          <w:sz w:val="22"/>
-          <w:szCs w:val="22"/>
-        </w:rPr>
-        <w:t>con load_data_from_csv().</w:t>
+        <w:t xml:space="preserve"> de matriz binaria, la cual se puede importar con el módulo pandas y la función </w:t>
+      </w:r>
+      <w:proofErr w:type="spellStart"/>
+      <w:r>
+        <w:rPr>
+          <w:rFonts w:ascii="Calibri" w:hAnsi="Calibri" w:cs="Calibri"/>
+          <w:sz w:val="22"/>
+          <w:szCs w:val="22"/>
+        </w:rPr>
+        <w:t>load</w:t>
+      </w:r>
+      <w:r>
+        <w:rPr>
+          <w:rFonts w:ascii="Calibri" w:hAnsi="Calibri" w:cs="Calibri"/>
+          <w:sz w:val="22"/>
+          <w:szCs w:val="22"/>
+        </w:rPr>
+        <w:t>_data_</w:t>
+      </w:r>
+      <w:proofErr w:type="gramStart"/>
+      <w:r>
+        <w:rPr>
+          <w:rFonts w:ascii="Calibri" w:hAnsi="Calibri" w:cs="Calibri"/>
+          <w:sz w:val="22"/>
+          <w:szCs w:val="22"/>
+        </w:rPr>
+        <w:t>matrix</w:t>
+      </w:r>
+      <w:proofErr w:type="spellEnd"/>
+      <w:r>
+        <w:rPr>
+          <w:rFonts w:ascii="Calibri" w:hAnsi="Calibri" w:cs="Calibri"/>
+          <w:sz w:val="22"/>
+          <w:szCs w:val="22"/>
+        </w:rPr>
+        <w:t>(</w:t>
+      </w:r>
+      <w:proofErr w:type="gramEnd"/>
+      <w:r>
+        <w:rPr>
+          <w:rFonts w:ascii="Calibri" w:hAnsi="Calibri" w:cs="Calibri"/>
+          <w:sz w:val="22"/>
+          <w:szCs w:val="22"/>
+        </w:rPr>
+        <w:t xml:space="preserve">) o, en caso de que esté en un fichero </w:t>
+      </w:r>
+      <w:proofErr w:type="spellStart"/>
+      <w:r>
+        <w:rPr>
+          <w:rFonts w:ascii="Calibri" w:hAnsi="Calibri" w:cs="Calibri"/>
+          <w:sz w:val="22"/>
+          <w:szCs w:val="22"/>
+        </w:rPr>
+        <w:t>csv</w:t>
+      </w:r>
+      <w:proofErr w:type="spellEnd"/>
+      <w:r>
+        <w:rPr>
+          <w:rFonts w:ascii="Calibri" w:hAnsi="Calibri" w:cs="Calibri"/>
+          <w:sz w:val="22"/>
+          <w:szCs w:val="22"/>
+        </w:rPr>
+        <w:t xml:space="preserve">, directamente </w:t>
+      </w:r>
+      <w:r>
+        <w:rPr>
+          <w:rFonts w:ascii="Calibri" w:hAnsi="Calibri" w:cs="Calibri"/>
+          <w:sz w:val="22"/>
+          <w:szCs w:val="22"/>
+        </w:rPr>
+        <w:t xml:space="preserve">con </w:t>
+      </w:r>
+      <w:proofErr w:type="spellStart"/>
+      <w:r>
+        <w:rPr>
+          <w:rFonts w:ascii="Calibri" w:hAnsi="Calibri" w:cs="Calibri"/>
+          <w:sz w:val="22"/>
+          <w:szCs w:val="22"/>
+        </w:rPr>
+        <w:t>load_data_from_csv</w:t>
+      </w:r>
+      <w:proofErr w:type="spellEnd"/>
+      <w:r>
+        <w:rPr>
+          <w:rFonts w:ascii="Calibri" w:hAnsi="Calibri" w:cs="Calibri"/>
+          <w:sz w:val="22"/>
+          <w:szCs w:val="22"/>
+        </w:rPr>
+        <w:t>().</w:t>
       </w:r>
     </w:p>
     <w:p>
@@ -765,7 +1074,43 @@
           <w:sz w:val="22"/>
           <w:szCs w:val="22"/>
         </w:rPr>
-        <w:t xml:space="preserve"> con la función set_penalty() que nos permite escoger entre</w:t>
+        <w:t xml:space="preserve"> con la función </w:t>
+      </w:r>
+      <w:proofErr w:type="spellStart"/>
+      <w:r>
+        <w:rPr>
+          <w:rFonts w:ascii="Calibri" w:hAnsi="Calibri" w:cs="Calibri"/>
+          <w:sz w:val="22"/>
+          <w:szCs w:val="22"/>
+        </w:rPr>
+        <w:t>set_</w:t>
+      </w:r>
+      <w:proofErr w:type="gramStart"/>
+      <w:r>
+        <w:rPr>
+          <w:rFonts w:ascii="Calibri" w:hAnsi="Calibri" w:cs="Calibri"/>
+          <w:sz w:val="22"/>
+          <w:szCs w:val="22"/>
+        </w:rPr>
+        <w:t>penalty</w:t>
+      </w:r>
+      <w:proofErr w:type="spellEnd"/>
+      <w:r>
+        <w:rPr>
+          <w:rFonts w:ascii="Calibri" w:hAnsi="Calibri" w:cs="Calibri"/>
+          <w:sz w:val="22"/>
+          <w:szCs w:val="22"/>
+        </w:rPr>
+        <w:t>(</w:t>
+      </w:r>
+      <w:proofErr w:type="gramEnd"/>
+      <w:r>
+        <w:rPr>
+          <w:rFonts w:ascii="Calibri" w:hAnsi="Calibri" w:cs="Calibri"/>
+          <w:sz w:val="22"/>
+          <w:szCs w:val="22"/>
+        </w:rPr>
+        <w:t>) que nos permite escoger entre</w:t>
       </w:r>
       <w:r>
         <w:rPr>
@@ -871,15 +1216,43 @@
           <w:sz w:val="22"/>
           <w:szCs w:val="22"/>
         </w:rPr>
-        <w:t>con la función lambda_from_cv</w:t>
-      </w:r>
-      <w:r>
-        <w:rPr>
-          <w:rFonts w:ascii="Calibri" w:hAnsi="Calibri" w:cs="Calibri"/>
-          <w:sz w:val="22"/>
-          <w:szCs w:val="22"/>
-        </w:rPr>
-        <w:t xml:space="preserve">() </w:t>
+        <w:t xml:space="preserve">con la función </w:t>
+      </w:r>
+      <w:proofErr w:type="spellStart"/>
+      <w:r>
+        <w:rPr>
+          <w:rFonts w:ascii="Calibri" w:hAnsi="Calibri" w:cs="Calibri"/>
+          <w:sz w:val="22"/>
+          <w:szCs w:val="22"/>
+        </w:rPr>
+        <w:t>lambda_from_</w:t>
+      </w:r>
+      <w:proofErr w:type="gramStart"/>
+      <w:r>
+        <w:rPr>
+          <w:rFonts w:ascii="Calibri" w:hAnsi="Calibri" w:cs="Calibri"/>
+          <w:sz w:val="22"/>
+          <w:szCs w:val="22"/>
+        </w:rPr>
+        <w:t>cv</w:t>
+      </w:r>
+      <w:proofErr w:type="spellEnd"/>
+      <w:r>
+        <w:rPr>
+          <w:rFonts w:ascii="Calibri" w:hAnsi="Calibri" w:cs="Calibri"/>
+          <w:sz w:val="22"/>
+          <w:szCs w:val="22"/>
+        </w:rPr>
+        <w:t>(</w:t>
+      </w:r>
+      <w:proofErr w:type="gramEnd"/>
+      <w:r>
+        <w:rPr>
+          <w:rFonts w:ascii="Calibri" w:hAnsi="Calibri" w:cs="Calibri"/>
+          <w:sz w:val="22"/>
+          <w:szCs w:val="22"/>
+        </w:rPr>
+        <w:t xml:space="preserve">) </w:t>
       </w:r>
       <w:r>
         <w:rPr>
@@ -959,7 +1332,25 @@
           <w:sz w:val="22"/>
           <w:szCs w:val="22"/>
         </w:rPr>
-        <w:t xml:space="preserve">Para ello indicamos los siguientes hiperparámetros: </w:t>
+        <w:t xml:space="preserve">Para ello indicamos los siguientes </w:t>
+      </w:r>
+      <w:proofErr w:type="spellStart"/>
+      <w:r>
+        <w:rPr>
+          <w:rFonts w:ascii="Calibri" w:hAnsi="Calibri" w:cs="Calibri"/>
+          <w:sz w:val="22"/>
+          <w:szCs w:val="22"/>
+        </w:rPr>
+        <w:t>hiperparámetros</w:t>
+      </w:r>
+      <w:proofErr w:type="spellEnd"/>
+      <w:r>
+        <w:rPr>
+          <w:rFonts w:ascii="Calibri" w:hAnsi="Calibri" w:cs="Calibri"/>
+          <w:sz w:val="22"/>
+          <w:szCs w:val="22"/>
+        </w:rPr>
+        <w:t xml:space="preserve">: </w:t>
       </w:r>
       <w:r>
         <w:rPr>
@@ -983,7 +1374,25 @@
           <w:sz w:val="22"/>
           <w:szCs w:val="22"/>
         </w:rPr>
-        <w:t xml:space="preserve">la cantidad de pasos que hay que dar entre estos límites y la cantidad de folds en que se quieren dividir los datos para la validación cruzada. </w:t>
+        <w:t xml:space="preserve">la cantidad de pasos que hay que dar entre estos límites y la cantidad de </w:t>
+      </w:r>
+      <w:proofErr w:type="spellStart"/>
+      <w:r>
+        <w:rPr>
+          <w:rFonts w:ascii="Calibri" w:hAnsi="Calibri" w:cs="Calibri"/>
+          <w:sz w:val="22"/>
+          <w:szCs w:val="22"/>
+        </w:rPr>
+        <w:t>folds</w:t>
+      </w:r>
+      <w:proofErr w:type="spellEnd"/>
+      <w:r>
+        <w:rPr>
+          <w:rFonts w:ascii="Calibri" w:hAnsi="Calibri" w:cs="Calibri"/>
+          <w:sz w:val="22"/>
+          <w:szCs w:val="22"/>
+        </w:rPr>
+        <w:t xml:space="preserve"> en que se quieren dividir los datos para la validación cruzada. </w:t>
       </w:r>
     </w:p>
     <w:p>
@@ -1017,15 +1426,35 @@
           <w:sz w:val="22"/>
           <w:szCs w:val="22"/>
         </w:rPr>
-        <w:t xml:space="preserve"> empleando la función train</w:t>
-      </w:r>
-      <w:r>
-        <w:rPr>
-          <w:rFonts w:ascii="Calibri" w:hAnsi="Calibri" w:cs="Calibri"/>
-          <w:sz w:val="22"/>
-          <w:szCs w:val="22"/>
-        </w:rPr>
-        <w:t>()</w:t>
+        <w:t xml:space="preserve"> empleando la función </w:t>
+      </w:r>
+      <w:proofErr w:type="spellStart"/>
+      <w:proofErr w:type="gramStart"/>
+      <w:r>
+        <w:rPr>
+          <w:rFonts w:ascii="Calibri" w:hAnsi="Calibri" w:cs="Calibri"/>
+          <w:sz w:val="22"/>
+          <w:szCs w:val="22"/>
+        </w:rPr>
+        <w:t>train</w:t>
+      </w:r>
+      <w:proofErr w:type="spellEnd"/>
+      <w:r>
+        <w:rPr>
+          <w:rFonts w:ascii="Calibri" w:hAnsi="Calibri" w:cs="Calibri"/>
+          <w:sz w:val="22"/>
+          <w:szCs w:val="22"/>
+        </w:rPr>
+        <w:t>(</w:t>
+      </w:r>
+      <w:proofErr w:type="gramEnd"/>
+      <w:r>
+        <w:rPr>
+          <w:rFonts w:ascii="Calibri" w:hAnsi="Calibri" w:cs="Calibri"/>
+          <w:sz w:val="22"/>
+          <w:szCs w:val="22"/>
+        </w:rPr>
+        <w:t>)</w:t>
       </w:r>
       <w:r>
         <w:rPr>
@@ -1057,7 +1486,25 @@
           <w:sz w:val="22"/>
           <w:szCs w:val="22"/>
         </w:rPr>
-        <w:t xml:space="preserve">resultados se pueden guardar en formato csv </w:t>
+        <w:t xml:space="preserve">resultados se pueden guardar en formato </w:t>
+      </w:r>
+      <w:proofErr w:type="spellStart"/>
+      <w:r>
+        <w:rPr>
+          <w:rFonts w:ascii="Calibri" w:hAnsi="Calibri" w:cs="Calibri"/>
+          <w:sz w:val="22"/>
+          <w:szCs w:val="22"/>
+        </w:rPr>
+        <w:t>csv</w:t>
+      </w:r>
+      <w:proofErr w:type="spellEnd"/>
+      <w:r>
+        <w:rPr>
+          <w:rFonts w:ascii="Calibri" w:hAnsi="Calibri" w:cs="Calibri"/>
+          <w:sz w:val="22"/>
+          <w:szCs w:val="22"/>
+        </w:rPr>
+        <w:t xml:space="preserve"> </w:t>
       </w:r>
       <w:r>
         <w:rPr>
@@ -1073,8 +1520,38 @@
           <w:sz w:val="22"/>
           <w:szCs w:val="22"/>
         </w:rPr>
-        <w:t xml:space="preserve"> json con result.save</w:t>
-      </w:r>
+        <w:t xml:space="preserve"> </w:t>
+      </w:r>
+      <w:proofErr w:type="spellStart"/>
+      <w:r>
+        <w:rPr>
+          <w:rFonts w:ascii="Calibri" w:hAnsi="Calibri" w:cs="Calibri"/>
+          <w:sz w:val="22"/>
+          <w:szCs w:val="22"/>
+        </w:rPr>
+        <w:t>json</w:t>
+      </w:r>
+      <w:proofErr w:type="spellEnd"/>
+      <w:r>
+        <w:rPr>
+          <w:rFonts w:ascii="Calibri" w:hAnsi="Calibri" w:cs="Calibri"/>
+          <w:sz w:val="22"/>
+          <w:szCs w:val="22"/>
+        </w:rPr>
+        <w:t xml:space="preserve"> con </w:t>
+      </w:r>
+      <w:proofErr w:type="spellStart"/>
+      <w:proofErr w:type="gramStart"/>
+      <w:r>
+        <w:rPr>
+          <w:rFonts w:ascii="Calibri" w:hAnsi="Calibri" w:cs="Calibri"/>
+          <w:sz w:val="22"/>
+          <w:szCs w:val="22"/>
+        </w:rPr>
+        <w:t>result.save</w:t>
+      </w:r>
+      <w:proofErr w:type="spellEnd"/>
+      <w:proofErr w:type="gramEnd"/>
       <w:r>
         <w:rPr>
           <w:rFonts w:ascii="Calibri" w:hAnsi="Calibri" w:cs="Calibri"/>
@@ -1818,6 +2295,7 @@
   <w:style w:type="character" w:default="1" w:styleId="Fuentedeprrafopredeter">
     <w:name w:val="Default Paragraph Font"/>
     <w:uiPriority w:val="1"/>
+    <w:semiHidden/>
     <w:unhideWhenUsed/>
   </w:style>
   <w:style w:type="table" w:default="1" w:styleId="Tablanormal">

</xml_diff>